<commit_message>
fix updating procedural_appointment and delete options
</commit_message>
<xml_diff>
--- a/patients/templates/patients/docs/card_paid_template.docx
+++ b/patients/templates/patients/docs/card_paid_template.docx
@@ -127,7 +127,23 @@
                 <w:b/>
                 <w:bCs/>
               </w:rPr>
-              <w:t>Общество с ограниченной ответственностью Медицинский центр «РевмаМед»</w:t>
+              <w:t>Общество с ограниченной ответственностью Медицинский центр «</w:t>
+            </w:r>
+            <w:proofErr w:type="spellStart"/>
+            <w:r>
+              <w:rPr>
+                <w:b/>
+                <w:bCs/>
+              </w:rPr>
+              <w:t>РевмаМед</w:t>
+            </w:r>
+            <w:proofErr w:type="spellEnd"/>
+            <w:r>
+              <w:rPr>
+                <w:b/>
+                <w:bCs/>
+              </w:rPr>
+              <w:t>»</w:t>
             </w:r>
           </w:p>
           <w:p/>
@@ -583,7 +599,6 @@
               </w:rPr>
               <w:t xml:space="preserve"> </w:t>
             </w:r>
-            <w:proofErr w:type="gramStart"/>
             <w:r>
               <w:rPr>
                 <w:b/>
@@ -591,9 +606,9 @@
                 <w:szCs w:val="28"/>
                 <w:u w:val="single"/>
               </w:rPr>
-              <w:t>{{ card</w:t>
-            </w:r>
-            <w:proofErr w:type="gramEnd"/>
+              <w:t xml:space="preserve">{{ </w:t>
+            </w:r>
+            <w:proofErr w:type="spellStart"/>
             <w:r>
               <w:rPr>
                 <w:b/>
@@ -601,7 +616,17 @@
                 <w:szCs w:val="28"/>
                 <w:u w:val="single"/>
               </w:rPr>
-              <w:t>_number }}</w:t>
+              <w:t>card_number</w:t>
+            </w:r>
+            <w:proofErr w:type="spellEnd"/>
+            <w:r>
+              <w:rPr>
+                <w:b/>
+                <w:sz w:val="28"/>
+                <w:szCs w:val="28"/>
+                <w:u w:val="single"/>
+              </w:rPr>
+              <w:t xml:space="preserve"> }}</w:t>
             </w:r>
           </w:p>
         </w:tc>
@@ -757,23 +782,31 @@
                 <w:szCs w:val="20"/>
               </w:rPr>
             </w:pPr>
-            <w:proofErr w:type="gramStart"/>
             <w:r>
               <w:rPr>
                 <w:sz w:val="20"/>
                 <w:szCs w:val="20"/>
                 <w:lang w:val="en-US"/>
               </w:rPr>
-              <w:t>{{ c</w:t>
-            </w:r>
-            <w:proofErr w:type="gramEnd"/>
+              <w:t xml:space="preserve">{{ </w:t>
+            </w:r>
+            <w:proofErr w:type="spellStart"/>
             <w:r>
               <w:rPr>
                 <w:sz w:val="20"/>
                 <w:szCs w:val="20"/>
                 <w:lang w:val="en-US"/>
               </w:rPr>
-              <w:t>_day }}</w:t>
+              <w:t>c_day</w:t>
+            </w:r>
+            <w:proofErr w:type="spellEnd"/>
+            <w:r>
+              <w:rPr>
+                <w:sz w:val="20"/>
+                <w:szCs w:val="20"/>
+                <w:lang w:val="en-US"/>
+              </w:rPr>
+              <w:t xml:space="preserve"> }}</w:t>
             </w:r>
           </w:p>
         </w:tc>
@@ -818,22 +851,29 @@
                 <w:lang w:val="en-US"/>
               </w:rPr>
             </w:pPr>
-            <w:proofErr w:type="gramStart"/>
             <w:r>
               <w:rPr>
                 <w:sz w:val="20"/>
                 <w:szCs w:val="20"/>
                 <w:lang w:val="en-US"/>
               </w:rPr>
-              <w:t>{{ cur</w:t>
-            </w:r>
-            <w:proofErr w:type="gramEnd"/>
+              <w:t xml:space="preserve">{{ </w:t>
+            </w:r>
+            <w:proofErr w:type="spellStart"/>
             <w:r>
               <w:rPr>
                 <w:sz w:val="20"/>
                 <w:szCs w:val="20"/>
                 <w:lang w:val="en-US"/>
               </w:rPr>
+              <w:t>cur</w:t>
+            </w:r>
+            <w:r>
+              <w:rPr>
+                <w:sz w:val="20"/>
+                <w:szCs w:val="20"/>
+                <w:lang w:val="en-US"/>
+              </w:rPr>
               <w:t>_</w:t>
             </w:r>
             <w:r>
@@ -842,7 +882,16 @@
                 <w:szCs w:val="20"/>
                 <w:lang w:val="en-US"/>
               </w:rPr>
-              <w:t>month_ru }}</w:t>
+              <w:t>month_ru</w:t>
+            </w:r>
+            <w:proofErr w:type="spellEnd"/>
+            <w:r>
+              <w:rPr>
+                <w:sz w:val="20"/>
+                <w:szCs w:val="20"/>
+                <w:lang w:val="en-US"/>
+              </w:rPr>
+              <w:t xml:space="preserve"> }}</w:t>
             </w:r>
           </w:p>
         </w:tc>
@@ -887,23 +936,31 @@
                 <w:lang w:val="en-US"/>
               </w:rPr>
             </w:pPr>
-            <w:proofErr w:type="gramStart"/>
             <w:r>
               <w:rPr>
                 <w:sz w:val="20"/>
                 <w:szCs w:val="20"/>
                 <w:lang w:val="en-US"/>
               </w:rPr>
-              <w:t>{{ current</w:t>
-            </w:r>
-            <w:proofErr w:type="gramEnd"/>
+              <w:t xml:space="preserve">{{ </w:t>
+            </w:r>
+            <w:proofErr w:type="spellStart"/>
             <w:r>
               <w:rPr>
                 <w:sz w:val="20"/>
                 <w:szCs w:val="20"/>
                 <w:lang w:val="en-US"/>
               </w:rPr>
-              <w:t>_year }}</w:t>
+              <w:t>current_year</w:t>
+            </w:r>
+            <w:proofErr w:type="spellEnd"/>
+            <w:r>
+              <w:rPr>
+                <w:sz w:val="20"/>
+                <w:szCs w:val="20"/>
+                <w:lang w:val="en-US"/>
+              </w:rPr>
+              <w:t xml:space="preserve"> }}</w:t>
             </w:r>
           </w:p>
         </w:tc>
@@ -956,95 +1013,49 @@
                 <w:lang w:val="en-US"/>
               </w:rPr>
             </w:pPr>
-            <w:proofErr w:type="gramStart"/>
             <w:r>
               <w:rPr>
                 <w:sz w:val="20"/>
                 <w:szCs w:val="20"/>
                 <w:lang w:val="en-US"/>
               </w:rPr>
-              <w:t>{{ surname</w:t>
-            </w:r>
-            <w:proofErr w:type="gramEnd"/>
+              <w:t xml:space="preserve">{{ surname }} {{ </w:t>
+            </w:r>
+            <w:proofErr w:type="spellStart"/>
             <w:r>
               <w:rPr>
                 <w:sz w:val="20"/>
                 <w:szCs w:val="20"/>
                 <w:lang w:val="en-US"/>
               </w:rPr>
+              <w:t>first_name</w:t>
+            </w:r>
+            <w:proofErr w:type="spellEnd"/>
+            <w:r>
+              <w:rPr>
+                <w:sz w:val="20"/>
+                <w:szCs w:val="20"/>
+                <w:lang w:val="en-US"/>
+              </w:rPr>
+              <w:t xml:space="preserve"> }} {{ </w:t>
+            </w:r>
+            <w:proofErr w:type="spellStart"/>
+            <w:r>
+              <w:rPr>
+                <w:sz w:val="20"/>
+                <w:szCs w:val="20"/>
+                <w:lang w:val="en-US"/>
+              </w:rPr>
+              <w:t>last_name</w:t>
+            </w:r>
+            <w:proofErr w:type="spellEnd"/>
+            <w:r>
+              <w:rPr>
+                <w:sz w:val="20"/>
+                <w:szCs w:val="20"/>
+                <w:lang w:val="en-US"/>
+              </w:rPr>
               <w:t xml:space="preserve"> }} </w:t>
-            </w:r>
-            <w:proofErr w:type="gramStart"/>
-            <w:r>
-              <w:rPr>
-                <w:sz w:val="20"/>
-                <w:szCs w:val="20"/>
-                <w:lang w:val="en-US"/>
-              </w:rPr>
-              <w:t>{{ first</w:t>
-            </w:r>
-            <w:proofErr w:type="gramEnd"/>
-            <w:r>
-              <w:rPr>
-                <w:sz w:val="20"/>
-                <w:szCs w:val="20"/>
-                <w:lang w:val="en-US"/>
-              </w:rPr>
-              <w:t>_</w:t>
-            </w:r>
-            <w:proofErr w:type="gramStart"/>
-            <w:r>
-              <w:rPr>
-                <w:sz w:val="20"/>
-                <w:szCs w:val="20"/>
-                <w:lang w:val="en-US"/>
-              </w:rPr>
-              <w:t>name }</w:t>
-            </w:r>
-            <w:proofErr w:type="gramEnd"/>
-            <w:r>
-              <w:rPr>
-                <w:sz w:val="20"/>
-                <w:szCs w:val="20"/>
-                <w:lang w:val="en-US"/>
-              </w:rPr>
-              <w:t xml:space="preserve">} </w:t>
-            </w:r>
-            <w:proofErr w:type="gramStart"/>
-            <w:r>
-              <w:rPr>
-                <w:sz w:val="20"/>
-                <w:szCs w:val="20"/>
-                <w:lang w:val="en-US"/>
-              </w:rPr>
-              <w:t>{{ last</w:t>
-            </w:r>
-            <w:proofErr w:type="gramEnd"/>
-            <w:r>
-              <w:rPr>
-                <w:sz w:val="20"/>
-                <w:szCs w:val="20"/>
-                <w:lang w:val="en-US"/>
-              </w:rPr>
-              <w:t>_</w:t>
-            </w:r>
-            <w:proofErr w:type="gramStart"/>
-            <w:r>
-              <w:rPr>
-                <w:sz w:val="20"/>
-                <w:szCs w:val="20"/>
-                <w:lang w:val="en-US"/>
-              </w:rPr>
-              <w:t>name }</w:t>
-            </w:r>
-            <w:proofErr w:type="gramEnd"/>
-            <w:r>
-              <w:rPr>
-                <w:sz w:val="20"/>
-                <w:szCs w:val="20"/>
-                <w:lang w:val="en-US"/>
-              </w:rPr>
-              <w:t xml:space="preserve">} </w:t>
             </w:r>
           </w:p>
         </w:tc>
@@ -1104,7 +1115,6 @@
                 <w:lang w:val="en-US"/>
               </w:rPr>
             </w:pPr>
-            <w:proofErr w:type="gramStart"/>
             <w:r>
               <w:rPr>
                 <w:sz w:val="20"/>
@@ -1113,21 +1123,15 @@
               </w:rPr>
               <w:t xml:space="preserve">{{ </w:t>
             </w:r>
-            <w:r>
-              <w:rPr>
-                <w:sz w:val="20"/>
-                <w:szCs w:val="20"/>
-              </w:rPr>
-              <w:t>b</w:t>
-            </w:r>
-            <w:proofErr w:type="gramEnd"/>
-            <w:r>
-              <w:rPr>
-                <w:sz w:val="20"/>
-                <w:szCs w:val="20"/>
-              </w:rPr>
-              <w:t>_day</w:t>
-            </w:r>
+            <w:proofErr w:type="spellStart"/>
+            <w:r>
+              <w:rPr>
+                <w:sz w:val="20"/>
+                <w:szCs w:val="20"/>
+              </w:rPr>
+              <w:t>b_day</w:t>
+            </w:r>
+            <w:proofErr w:type="spellEnd"/>
             <w:r>
               <w:rPr>
                 <w:sz w:val="20"/>
@@ -1176,7 +1180,6 @@
                 <w:lang w:val="en-US"/>
               </w:rPr>
             </w:pPr>
-            <w:proofErr w:type="gramStart"/>
             <w:r>
               <w:rPr>
                 <w:sz w:val="20"/>
@@ -1185,21 +1188,15 @@
               </w:rPr>
               <w:t xml:space="preserve">{{ </w:t>
             </w:r>
-            <w:r>
-              <w:rPr>
-                <w:sz w:val="20"/>
-                <w:szCs w:val="20"/>
-              </w:rPr>
-              <w:t>b</w:t>
-            </w:r>
-            <w:proofErr w:type="gramEnd"/>
-            <w:r>
-              <w:rPr>
-                <w:sz w:val="20"/>
-                <w:szCs w:val="20"/>
-              </w:rPr>
-              <w:t>_month_name</w:t>
-            </w:r>
+            <w:proofErr w:type="spellStart"/>
+            <w:r>
+              <w:rPr>
+                <w:sz w:val="20"/>
+                <w:szCs w:val="20"/>
+              </w:rPr>
+              <w:t>b_month_name</w:t>
+            </w:r>
+            <w:proofErr w:type="spellEnd"/>
             <w:r>
               <w:rPr>
                 <w:sz w:val="20"/>
@@ -1244,23 +1241,31 @@
                 <w:lang w:val="en-US"/>
               </w:rPr>
             </w:pPr>
-            <w:proofErr w:type="gramStart"/>
             <w:r>
               <w:rPr>
                 <w:sz w:val="20"/>
                 <w:szCs w:val="20"/>
                 <w:lang w:val="en-US"/>
               </w:rPr>
-              <w:t>{{ b</w:t>
-            </w:r>
-            <w:proofErr w:type="gramEnd"/>
+              <w:t xml:space="preserve">{{ </w:t>
+            </w:r>
+            <w:proofErr w:type="spellStart"/>
             <w:r>
               <w:rPr>
                 <w:sz w:val="20"/>
                 <w:szCs w:val="20"/>
                 <w:lang w:val="en-US"/>
               </w:rPr>
-              <w:t>_year }}</w:t>
+              <w:t>b_year</w:t>
+            </w:r>
+            <w:proofErr w:type="spellEnd"/>
+            <w:r>
+              <w:rPr>
+                <w:sz w:val="20"/>
+                <w:szCs w:val="20"/>
+                <w:lang w:val="en-US"/>
+              </w:rPr>
+              <w:t xml:space="preserve"> }}</w:t>
             </w:r>
           </w:p>
         </w:tc>
@@ -1282,15 +1287,7 @@
                 <w:sz w:val="20"/>
                 <w:szCs w:val="20"/>
               </w:rPr>
-              <w:t xml:space="preserve"> г. </w:t>
-            </w:r>
-            <w:proofErr w:type="gramStart"/>
-            <w:r>
-              <w:rPr>
-                <w:sz w:val="20"/>
-                <w:szCs w:val="20"/>
-              </w:rPr>
-              <w:t xml:space="preserve">Пол: </w:t>
+              <w:t xml:space="preserve"> г. Пол: </w:t>
             </w:r>
             <w:r>
               <w:rPr>
@@ -1299,37 +1296,7 @@
                 <w:u w:val="single"/>
                 <w:lang w:val="en-US"/>
               </w:rPr>
-              <w:t xml:space="preserve">     {{ gender</w:t>
-            </w:r>
-            <w:proofErr w:type="gramEnd"/>
-            <w:r>
-              <w:rPr>
-                <w:sz w:val="20"/>
-                <w:szCs w:val="20"/>
-                <w:u w:val="single"/>
-                <w:lang w:val="en-US"/>
-              </w:rPr>
-              <w:t xml:space="preserve"> </w:t>
-            </w:r>
-            <w:proofErr w:type="gramStart"/>
-            <w:r>
-              <w:rPr>
-                <w:sz w:val="20"/>
-                <w:szCs w:val="20"/>
-                <w:u w:val="single"/>
-                <w:lang w:val="en-US"/>
-              </w:rPr>
-              <w:t xml:space="preserve">}}   </w:t>
-            </w:r>
-            <w:proofErr w:type="gramEnd"/>
-            <w:r>
-              <w:rPr>
-                <w:sz w:val="20"/>
-                <w:szCs w:val="20"/>
-                <w:u w:val="single"/>
-                <w:lang w:val="en-US"/>
-              </w:rPr>
-              <w:t xml:space="preserve">   </w:t>
+              <w:t xml:space="preserve">     {{ gender }}      </w:t>
             </w:r>
             <w:r>
               <w:rPr>
@@ -1422,7 +1389,6 @@
                 <w:lang w:val="en-US"/>
               </w:rPr>
             </w:pPr>
-            <w:proofErr w:type="gramStart"/>
             <w:r>
               <w:rPr>
                 <w:sz w:val="20"/>
@@ -1431,10 +1397,11 @@
               </w:rPr>
               <w:t xml:space="preserve">{{ </w:t>
             </w:r>
+            <w:proofErr w:type="spellStart"/>
             <w:r>
               <w:t>passport</w:t>
             </w:r>
-            <w:proofErr w:type="gramEnd"/>
+            <w:proofErr w:type="spellEnd"/>
             <w:r>
               <w:rPr>
                 <w:lang w:val="en-US"/>
@@ -1482,7 +1449,6 @@
                 <w:szCs w:val="20"/>
               </w:rPr>
             </w:pPr>
-            <w:proofErr w:type="gramStart"/>
             <w:r>
               <w:rPr>
                 <w:sz w:val="20"/>
@@ -1491,21 +1457,15 @@
               </w:rPr>
               <w:t xml:space="preserve">{{ </w:t>
             </w:r>
-            <w:r>
-              <w:rPr>
-                <w:sz w:val="20"/>
-                <w:szCs w:val="20"/>
-              </w:rPr>
-              <w:t>p</w:t>
-            </w:r>
-            <w:proofErr w:type="gramEnd"/>
-            <w:r>
-              <w:rPr>
-                <w:sz w:val="20"/>
-                <w:szCs w:val="20"/>
-              </w:rPr>
-              <w:t>_series</w:t>
-            </w:r>
+            <w:proofErr w:type="spellStart"/>
+            <w:r>
+              <w:rPr>
+                <w:sz w:val="20"/>
+                <w:szCs w:val="20"/>
+              </w:rPr>
+              <w:t>p_series</w:t>
+            </w:r>
+            <w:proofErr w:type="spellEnd"/>
             <w:r>
               <w:rPr>
                 <w:sz w:val="20"/>
@@ -1556,7 +1516,6 @@
                 <w:lang w:val="en-US"/>
               </w:rPr>
             </w:pPr>
-            <w:proofErr w:type="gramStart"/>
             <w:r>
               <w:rPr>
                 <w:sz w:val="20"/>
@@ -1565,21 +1524,15 @@
               </w:rPr>
               <w:t xml:space="preserve">{{ </w:t>
             </w:r>
-            <w:r>
-              <w:rPr>
-                <w:sz w:val="20"/>
-                <w:szCs w:val="20"/>
-              </w:rPr>
-              <w:t>p</w:t>
-            </w:r>
-            <w:proofErr w:type="gramEnd"/>
-            <w:r>
-              <w:rPr>
-                <w:sz w:val="20"/>
-                <w:szCs w:val="20"/>
-              </w:rPr>
-              <w:t>_number</w:t>
-            </w:r>
+            <w:proofErr w:type="spellStart"/>
+            <w:r>
+              <w:rPr>
+                <w:sz w:val="20"/>
+                <w:szCs w:val="20"/>
+              </w:rPr>
+              <w:t>p_number</w:t>
+            </w:r>
+            <w:proofErr w:type="spellEnd"/>
             <w:r>
               <w:rPr>
                 <w:sz w:val="20"/>
@@ -1639,7 +1592,6 @@
                 <w:lang w:val="en-US"/>
               </w:rPr>
             </w:pPr>
-            <w:proofErr w:type="gramStart"/>
             <w:r>
               <w:rPr>
                 <w:sz w:val="20"/>
@@ -1648,21 +1600,15 @@
               </w:rPr>
               <w:t xml:space="preserve">{{ </w:t>
             </w:r>
-            <w:r>
-              <w:rPr>
-                <w:sz w:val="20"/>
-                <w:szCs w:val="20"/>
-              </w:rPr>
-              <w:t>phone</w:t>
-            </w:r>
-            <w:proofErr w:type="gramEnd"/>
-            <w:r>
-              <w:rPr>
-                <w:sz w:val="20"/>
-                <w:szCs w:val="20"/>
-              </w:rPr>
-              <w:t>_number</w:t>
-            </w:r>
+            <w:proofErr w:type="spellStart"/>
+            <w:r>
+              <w:rPr>
+                <w:sz w:val="20"/>
+                <w:szCs w:val="20"/>
+              </w:rPr>
+              <w:t>phone_number</w:t>
+            </w:r>
+            <w:proofErr w:type="spellEnd"/>
             <w:r>
               <w:rPr>
                 <w:sz w:val="20"/>
@@ -1763,7 +1709,6 @@
                 <w:lang w:val="en-US"/>
               </w:rPr>
             </w:pPr>
-            <w:proofErr w:type="gramStart"/>
             <w:r>
               <w:rPr>
                 <w:sz w:val="20"/>
@@ -1772,6 +1717,7 @@
               </w:rPr>
               <w:t xml:space="preserve">{{ </w:t>
             </w:r>
+            <w:proofErr w:type="spellStart"/>
             <w:r>
               <w:rPr>
                 <w:sz w:val="20"/>
@@ -1779,7 +1725,7 @@
               </w:rPr>
               <w:t>area</w:t>
             </w:r>
-            <w:proofErr w:type="gramEnd"/>
+            <w:proofErr w:type="spellEnd"/>
             <w:r>
               <w:rPr>
                 <w:sz w:val="20"/>
@@ -1835,7 +1781,6 @@
                 <w:lang w:val="en-US"/>
               </w:rPr>
             </w:pPr>
-            <w:proofErr w:type="gramStart"/>
             <w:r>
               <w:rPr>
                 <w:sz w:val="20"/>
@@ -1844,6 +1789,7 @@
               </w:rPr>
               <w:t xml:space="preserve">{{ </w:t>
             </w:r>
+            <w:proofErr w:type="spellStart"/>
             <w:r>
               <w:rPr>
                 <w:sz w:val="20"/>
@@ -1851,7 +1797,7 @@
               </w:rPr>
               <w:t>district</w:t>
             </w:r>
-            <w:proofErr w:type="gramEnd"/>
+            <w:proofErr w:type="spellEnd"/>
             <w:r>
               <w:rPr>
                 <w:sz w:val="20"/>
@@ -1902,7 +1848,6 @@
                 <w:lang w:val="en-US"/>
               </w:rPr>
             </w:pPr>
-            <w:proofErr w:type="gramStart"/>
             <w:r>
               <w:rPr>
                 <w:sz w:val="20"/>
@@ -1911,6 +1856,7 @@
               </w:rPr>
               <w:t xml:space="preserve">{{ </w:t>
             </w:r>
+            <w:proofErr w:type="spellStart"/>
             <w:r>
               <w:rPr>
                 <w:sz w:val="20"/>
@@ -1918,7 +1864,7 @@
               </w:rPr>
               <w:t>locality</w:t>
             </w:r>
-            <w:proofErr w:type="gramEnd"/>
+            <w:proofErr w:type="spellEnd"/>
             <w:r>
               <w:rPr>
                 <w:sz w:val="20"/>
@@ -1972,7 +1918,6 @@
             <w:pPr>
               <w:jc w:val="center"/>
             </w:pPr>
-            <w:proofErr w:type="gramStart"/>
             <w:r>
               <w:rPr>
                 <w:sz w:val="20"/>
@@ -1981,10 +1926,11 @@
               </w:rPr>
               <w:t xml:space="preserve">{{ </w:t>
             </w:r>
+            <w:proofErr w:type="spellStart"/>
             <w:r>
               <w:t>street</w:t>
             </w:r>
-            <w:proofErr w:type="gramEnd"/>
+            <w:proofErr w:type="spellEnd"/>
             <w:r>
               <w:t xml:space="preserve"> </w:t>
             </w:r>
@@ -2033,7 +1979,6 @@
             <w:pPr>
               <w:jc w:val="center"/>
             </w:pPr>
-            <w:proofErr w:type="gramStart"/>
             <w:r>
               <w:rPr>
                 <w:sz w:val="20"/>
@@ -2042,10 +1987,11 @@
               </w:rPr>
               <w:t xml:space="preserve">{{ </w:t>
             </w:r>
+            <w:proofErr w:type="spellStart"/>
             <w:r>
               <w:t>home</w:t>
             </w:r>
-            <w:proofErr w:type="gramEnd"/>
+            <w:proofErr w:type="spellEnd"/>
             <w:r>
               <w:t xml:space="preserve"> </w:t>
             </w:r>
@@ -2095,7 +2041,6 @@
             <w:pPr>
               <w:jc w:val="center"/>
             </w:pPr>
-            <w:proofErr w:type="gramStart"/>
             <w:r>
               <w:rPr>
                 <w:sz w:val="20"/>
@@ -2104,10 +2049,11 @@
               </w:rPr>
               <w:t xml:space="preserve">{{ </w:t>
             </w:r>
+            <w:proofErr w:type="spellStart"/>
             <w:r>
               <w:t>building</w:t>
             </w:r>
-            <w:proofErr w:type="gramEnd"/>
+            <w:proofErr w:type="spellEnd"/>
             <w:r>
               <w:t xml:space="preserve"> </w:t>
             </w:r>
@@ -2159,7 +2105,6 @@
                 <w:lang w:val="en-US"/>
               </w:rPr>
             </w:pPr>
-            <w:proofErr w:type="gramStart"/>
             <w:r>
               <w:rPr>
                 <w:sz w:val="20"/>
@@ -2168,10 +2113,11 @@
               </w:rPr>
               <w:t xml:space="preserve">{{ </w:t>
             </w:r>
+            <w:proofErr w:type="spellStart"/>
             <w:r>
               <w:t>apartment</w:t>
             </w:r>
-            <w:proofErr w:type="gramEnd"/>
+            <w:proofErr w:type="spellEnd"/>
             <w:r>
               <w:rPr>
                 <w:lang w:val="en-US"/>
@@ -3206,12 +3152,21 @@
                 <w:szCs w:val="20"/>
               </w:rPr>
             </w:pPr>
-            <w:r>
-              <w:rPr>
-                <w:sz w:val="20"/>
-                <w:szCs w:val="20"/>
-              </w:rPr>
-              <w:t>щийся — 4, не работает — 5, прочее — 6</w:t>
+            <w:proofErr w:type="spellStart"/>
+            <w:r>
+              <w:rPr>
+                <w:sz w:val="20"/>
+                <w:szCs w:val="20"/>
+              </w:rPr>
+              <w:t>щийся</w:t>
+            </w:r>
+            <w:proofErr w:type="spellEnd"/>
+            <w:r>
+              <w:rPr>
+                <w:sz w:val="20"/>
+                <w:szCs w:val="20"/>
+              </w:rPr>
+              <w:t xml:space="preserve"> — 4, не работает — 5, прочее — 6</w:t>
             </w:r>
           </w:p>
         </w:tc>
@@ -5279,8 +5234,17 @@
                 <w:sz w:val="20"/>
                 <w:szCs w:val="20"/>
               </w:rPr>
-              <w:t>антиген К1 системы Kell</w:t>
-            </w:r>
+              <w:t xml:space="preserve">антиген К1 системы </w:t>
+            </w:r>
+            <w:proofErr w:type="spellStart"/>
+            <w:r>
+              <w:rPr>
+                <w:sz w:val="20"/>
+                <w:szCs w:val="20"/>
+              </w:rPr>
+              <w:t>Kell</w:t>
+            </w:r>
+            <w:proofErr w:type="spellEnd"/>
           </w:p>
         </w:tc>
         <w:tc>
@@ -5430,7 +5394,7 @@
           <w:sz w:val="20"/>
           <w:szCs w:val="20"/>
         </w:rPr>
-        <w:t>иные виды непереносимости в анаамнезе,</w:t>
+        <w:t>иные виды непереносимости в анамнезе,</w:t>
       </w:r>
       <w:r>
         <w:rPr>
@@ -5691,16 +5655,7 @@
           <w:szCs w:val="22"/>
           <w:lang w:val="ru-RU"/>
         </w:rPr>
-        <w:t>В соответствии с требованиями статьи 9 федерального закона от 27.07.06 г. «О персональных данных» № 152-ФЗ я</w:t>
-      </w:r>
-      <w:r>
-        <w:rPr>
-          <w:rFonts w:ascii="Times New Roman" w:hAnsi="Times New Roman"/>
-          <w:sz w:val="22"/>
-          <w:szCs w:val="22"/>
-          <w:lang w:val="ru-RU"/>
-        </w:rPr>
-        <w:t xml:space="preserve">, </w:t>
+        <w:t xml:space="preserve">В соответствии с требованиями статьи 9 федерального закона от 27.07.06 г. «О персональных данных» № 152-ФЗ я, </w:t>
       </w:r>
       <w:r>
         <w:rPr>
@@ -5711,8 +5666,9 @@
           <w:szCs w:val="22"/>
           <w:lang w:val="ru-RU"/>
         </w:rPr>
-        <w:t>{{ surname }} {{ first_name }} {{ last_name }}</w:t>
-      </w:r>
+        <w:t xml:space="preserve">{{ </w:t>
+      </w:r>
+      <w:proofErr w:type="spellStart"/>
       <w:r>
         <w:rPr>
           <w:rFonts w:ascii="Times New Roman" w:hAnsi="Times New Roman"/>
@@ -5722,16 +5678,107 @@
           <w:szCs w:val="22"/>
           <w:lang w:val="ru-RU"/>
         </w:rPr>
-        <w:t>,</w:t>
-      </w:r>
-      <w:r>
-        <w:rPr>
-          <w:rFonts w:ascii="Times New Roman" w:hAnsi="Times New Roman"/>
+        <w:t>surname</w:t>
+      </w:r>
+      <w:proofErr w:type="spellEnd"/>
+      <w:r>
+        <w:rPr>
+          <w:rFonts w:ascii="Times New Roman" w:hAnsi="Times New Roman"/>
+          <w:b/>
+          <w:bCs/>
           <w:sz w:val="22"/>
           <w:szCs w:val="22"/>
           <w:lang w:val="ru-RU"/>
         </w:rPr>
-        <w:t xml:space="preserve"> подтверждаю своё согласие на обработку ООО МЦ «РевмаМед» (далее - Оператор) моих персональных данных, включающих фамилию, имя, отчество, пол, дату рождения, адрес места жительства, профессия, образование, семейное положение, контактный(е) телефон(ы), реквизиты полиса ОМС (ДМС), страховой номер индивидуального лицевого счёта в Пенсионном фонде России (СНИЛС), данные о состоянии здоровья, заболеваниях, случаях обращения за медицинской помощью — в медико-профилактических целях, в целях установления медицинского диагноза и оказания медицинских услуг при условии, что их обработка осуществляется лицом, профессионально занимающимся медицинской деятельностью и обязанным сохранять врачебную тайну. В процессе оказания Оператором медицинской помощи я предоставляю право медицинским работникам передавать мои персональные данные, содержащие сведения, составляющие врачебную тайну, другим должностным лицам Оператора, в интересах моего обследования и лечения (обследования и лечения несовершеннолетнего пациента/лица, признанного недееспособным). Предоставляю Оператору право осуществлять все действия (операции) с моими персональными данными, включая сбор, систематизацию, накопление, хранение, обновление, изменение, использование, обезличивание, блокирование, уничтожение. Оператор вправе обрабатывать вышеуказанные персональные данные посредством внесения их в электронную базу данных, включения в списки (реестры) и отчётные формы, предусмотренные документами, регламентирующими предоставление отчётных данных (документов) по ОМС (договором ДМС).</w:t>
+        <w:t xml:space="preserve"> }} {{ </w:t>
+      </w:r>
+      <w:proofErr w:type="spellStart"/>
+      <w:r>
+        <w:rPr>
+          <w:rFonts w:ascii="Times New Roman" w:hAnsi="Times New Roman"/>
+          <w:b/>
+          <w:bCs/>
+          <w:sz w:val="22"/>
+          <w:szCs w:val="22"/>
+          <w:lang w:val="ru-RU"/>
+        </w:rPr>
+        <w:t>first_name</w:t>
+      </w:r>
+      <w:proofErr w:type="spellEnd"/>
+      <w:r>
+        <w:rPr>
+          <w:rFonts w:ascii="Times New Roman" w:hAnsi="Times New Roman"/>
+          <w:b/>
+          <w:bCs/>
+          <w:sz w:val="22"/>
+          <w:szCs w:val="22"/>
+          <w:lang w:val="ru-RU"/>
+        </w:rPr>
+        <w:t xml:space="preserve"> }} {{ </w:t>
+      </w:r>
+      <w:proofErr w:type="spellStart"/>
+      <w:r>
+        <w:rPr>
+          <w:rFonts w:ascii="Times New Roman" w:hAnsi="Times New Roman"/>
+          <w:b/>
+          <w:bCs/>
+          <w:sz w:val="22"/>
+          <w:szCs w:val="22"/>
+          <w:lang w:val="ru-RU"/>
+        </w:rPr>
+        <w:t>last_name</w:t>
+      </w:r>
+      <w:proofErr w:type="spellEnd"/>
+      <w:r>
+        <w:rPr>
+          <w:rFonts w:ascii="Times New Roman" w:hAnsi="Times New Roman"/>
+          <w:b/>
+          <w:bCs/>
+          <w:sz w:val="22"/>
+          <w:szCs w:val="22"/>
+          <w:lang w:val="ru-RU"/>
+        </w:rPr>
+        <w:t xml:space="preserve"> }}</w:t>
+      </w:r>
+      <w:r>
+        <w:rPr>
+          <w:rFonts w:ascii="Times New Roman" w:hAnsi="Times New Roman"/>
+          <w:b/>
+          <w:bCs/>
+          <w:sz w:val="22"/>
+          <w:szCs w:val="22"/>
+          <w:lang w:val="ru-RU"/>
+        </w:rPr>
+        <w:t>,</w:t>
+      </w:r>
+      <w:r>
+        <w:rPr>
+          <w:rFonts w:ascii="Times New Roman" w:hAnsi="Times New Roman"/>
+          <w:sz w:val="22"/>
+          <w:szCs w:val="22"/>
+          <w:lang w:val="ru-RU"/>
+        </w:rPr>
+        <w:t xml:space="preserve"> подтверждаю своё согласие на обработку ООО МЦ «</w:t>
+      </w:r>
+      <w:proofErr w:type="spellStart"/>
+      <w:r>
+        <w:rPr>
+          <w:rFonts w:ascii="Times New Roman" w:hAnsi="Times New Roman"/>
+          <w:sz w:val="22"/>
+          <w:szCs w:val="22"/>
+          <w:lang w:val="ru-RU"/>
+        </w:rPr>
+        <w:t>РевмаМед</w:t>
+      </w:r>
+      <w:proofErr w:type="spellEnd"/>
+      <w:r>
+        <w:rPr>
+          <w:rFonts w:ascii="Times New Roman" w:hAnsi="Times New Roman"/>
+          <w:sz w:val="22"/>
+          <w:szCs w:val="22"/>
+          <w:lang w:val="ru-RU"/>
+        </w:rPr>
+        <w:t>» (далее - Оператор) моих персональных данных, включающих фамилию, имя, отчество, пол, дату рождения, адрес места жительства, профессия, образование, семейное положение, контактный(е) телефон(ы), реквизиты полиса ОМС (ДМС), страховой номер индивидуального лицевого счёта в Пенсионном фонде России (СНИЛС), данные о состоянии здоровья, заболеваниях, случаях обращения за медицинской помощью — в медико-профилактических целях, в целях установления медицинского диагноза и оказания медицинских услуг при условии, что их обработка осуществляется лицом, профессионально занимающимся медицинской деятельностью и обязанным сохранять врачебную тайну. В процессе оказания Оператором медицинской помощи я предоставляю право медицинским работникам передавать мои персональные данные, содержащие сведения, составляющие врачебную тайну, другим должностным лицам Оператора, в интересах моего обследования и лечения (обследования и лечения несовершеннолетнего пациента/лица, признанного недееспособным). Предоставляю Оператору право осуществлять все действия (операции) с моими персональными данными, включая сбор, систематизацию, накопление, хранение, обновление, изменение, использование, обезличивание, блокирование, уничтожение. Оператор вправе обрабатывать вышеуказанные персональные данные посредством внесения их в электронную базу данных, включения в списки (реестры) и отчётные формы, предусмотренные документами, регламентирующими предоставление отчётных данных (документов) по ОМС (договором ДМС).</w:t>
       </w:r>
     </w:p>
     <w:p>
@@ -5854,55 +5901,50 @@
           <w:szCs w:val="22"/>
           <w:lang w:val="ru-RU"/>
         </w:rPr>
-        <w:t>«</w:t>
-      </w:r>
-      <w:proofErr w:type="gramStart"/>
+        <w:t xml:space="preserve">«{{ </w:t>
+      </w:r>
       <w:r>
         <w:rPr>
           <w:rFonts w:ascii="Times New Roman" w:hAnsi="Times New Roman"/>
           <w:sz w:val="22"/>
           <w:szCs w:val="22"/>
-          <w:lang w:val="ru-RU"/>
-        </w:rPr>
-        <w:t xml:space="preserve">{{ </w:t>
+        </w:rPr>
+        <w:t>c</w:t>
       </w:r>
       <w:r>
         <w:rPr>
           <w:rFonts w:ascii="Times New Roman" w:hAnsi="Times New Roman"/>
           <w:sz w:val="22"/>
           <w:szCs w:val="22"/>
-        </w:rPr>
-        <w:t>c</w:t>
-      </w:r>
-      <w:proofErr w:type="gramEnd"/>
+          <w:lang w:val="ru-RU"/>
+        </w:rPr>
+        <w:t>_</w:t>
+      </w:r>
       <w:r>
         <w:rPr>
           <w:rFonts w:ascii="Times New Roman" w:hAnsi="Times New Roman"/>
           <w:sz w:val="22"/>
           <w:szCs w:val="22"/>
-          <w:lang w:val="ru-RU"/>
-        </w:rPr>
-        <w:t>_</w:t>
-      </w:r>
-      <w:proofErr w:type="gramStart"/>
+        </w:rPr>
+        <w:t>day</w:t>
+      </w:r>
       <w:r>
         <w:rPr>
           <w:rFonts w:ascii="Times New Roman" w:hAnsi="Times New Roman"/>
           <w:sz w:val="22"/>
           <w:szCs w:val="22"/>
-        </w:rPr>
-        <w:t>day</w:t>
+          <w:lang w:val="ru-RU"/>
+        </w:rPr>
+        <w:t xml:space="preserve"> }}» {{ </w:t>
       </w:r>
       <w:r>
         <w:rPr>
           <w:rFonts w:ascii="Times New Roman" w:hAnsi="Times New Roman"/>
           <w:sz w:val="22"/>
           <w:szCs w:val="22"/>
-          <w:lang w:val="ru-RU"/>
-        </w:rPr>
-        <w:t xml:space="preserve"> }</w:t>
-      </w:r>
-      <w:proofErr w:type="gramEnd"/>
+        </w:rPr>
+        <w:t>cur</w:t>
+      </w:r>
       <w:r>
         <w:rPr>
           <w:rFonts w:ascii="Times New Roman" w:hAnsi="Times New Roman"/>
@@ -5910,72 +5952,69 @@
           <w:szCs w:val="22"/>
           <w:lang w:val="ru-RU"/>
         </w:rPr>
-        <w:t xml:space="preserve">}» </w:t>
-      </w:r>
-      <w:proofErr w:type="gramStart"/>
+        <w:t>_</w:t>
+      </w:r>
       <w:r>
         <w:rPr>
           <w:rFonts w:ascii="Times New Roman" w:hAnsi="Times New Roman"/>
           <w:sz w:val="22"/>
           <w:szCs w:val="22"/>
-          <w:lang w:val="ru-RU"/>
-        </w:rPr>
-        <w:t xml:space="preserve">{{ </w:t>
+        </w:rPr>
+        <w:t>month</w:t>
       </w:r>
       <w:r>
         <w:rPr>
           <w:rFonts w:ascii="Times New Roman" w:hAnsi="Times New Roman"/>
           <w:sz w:val="22"/>
           <w:szCs w:val="22"/>
-        </w:rPr>
-        <w:t>cur</w:t>
-      </w:r>
-      <w:proofErr w:type="gramEnd"/>
+          <w:lang w:val="ru-RU"/>
+        </w:rPr>
+        <w:t>_</w:t>
+      </w:r>
+      <w:proofErr w:type="spellStart"/>
       <w:r>
         <w:rPr>
           <w:rFonts w:ascii="Times New Roman" w:hAnsi="Times New Roman"/>
           <w:sz w:val="22"/>
           <w:szCs w:val="22"/>
-          <w:lang w:val="ru-RU"/>
-        </w:rPr>
-        <w:t>_</w:t>
-      </w:r>
+        </w:rPr>
+        <w:t>ru</w:t>
+      </w:r>
+      <w:proofErr w:type="spellEnd"/>
       <w:r>
         <w:rPr>
           <w:rFonts w:ascii="Times New Roman" w:hAnsi="Times New Roman"/>
           <w:sz w:val="22"/>
           <w:szCs w:val="22"/>
-        </w:rPr>
-        <w:t>month</w:t>
+          <w:lang w:val="ru-RU"/>
+        </w:rPr>
+        <w:t xml:space="preserve"> }} {{ </w:t>
       </w:r>
       <w:r>
         <w:rPr>
           <w:rFonts w:ascii="Times New Roman" w:hAnsi="Times New Roman"/>
           <w:sz w:val="22"/>
           <w:szCs w:val="22"/>
-          <w:lang w:val="ru-RU"/>
-        </w:rPr>
-        <w:t>_</w:t>
-      </w:r>
-      <w:proofErr w:type="gramStart"/>
+        </w:rPr>
+        <w:t>current</w:t>
+      </w:r>
       <w:r>
         <w:rPr>
           <w:rFonts w:ascii="Times New Roman" w:hAnsi="Times New Roman"/>
           <w:sz w:val="22"/>
           <w:szCs w:val="22"/>
-        </w:rPr>
-        <w:t>ru</w:t>
+          <w:lang w:val="ru-RU"/>
+        </w:rPr>
+        <w:t>_</w:t>
       </w:r>
       <w:r>
         <w:rPr>
           <w:rFonts w:ascii="Times New Roman" w:hAnsi="Times New Roman"/>
           <w:sz w:val="22"/>
           <w:szCs w:val="22"/>
-          <w:lang w:val="ru-RU"/>
-        </w:rPr>
-        <w:t xml:space="preserve"> }</w:t>
-      </w:r>
-      <w:proofErr w:type="gramEnd"/>
+        </w:rPr>
+        <w:t>year</w:t>
+      </w:r>
       <w:r>
         <w:rPr>
           <w:rFonts w:ascii="Times New Roman" w:hAnsi="Times New Roman"/>
@@ -5983,9 +6022,8 @@
           <w:szCs w:val="22"/>
           <w:lang w:val="ru-RU"/>
         </w:rPr>
-        <w:t xml:space="preserve">} </w:t>
-      </w:r>
-      <w:proofErr w:type="gramStart"/>
+        <w:t xml:space="preserve"> }}</w:t>
+      </w:r>
       <w:r>
         <w:rPr>
           <w:rFonts w:ascii="Times New Roman" w:hAnsi="Times New Roman"/>
@@ -5993,17 +6031,17 @@
           <w:szCs w:val="22"/>
           <w:lang w:val="ru-RU"/>
         </w:rPr>
-        <w:t xml:space="preserve">{{ </w:t>
+        <w:t>г</w:t>
       </w:r>
       <w:r>
         <w:rPr>
           <w:rFonts w:ascii="Times New Roman" w:hAnsi="Times New Roman"/>
           <w:sz w:val="22"/>
           <w:szCs w:val="22"/>
-        </w:rPr>
-        <w:t>current</w:t>
-      </w:r>
-      <w:proofErr w:type="gramEnd"/>
+          <w:lang w:val="ru-RU"/>
+        </w:rPr>
+        <w:t xml:space="preserve">. </w:t>
+      </w:r>
       <w:r>
         <w:rPr>
           <w:rFonts w:ascii="Times New Roman" w:hAnsi="Times New Roman"/>
@@ -6011,16 +6049,16 @@
           <w:szCs w:val="22"/>
           <w:lang w:val="ru-RU"/>
         </w:rPr>
-        <w:t>_</w:t>
-      </w:r>
-      <w:proofErr w:type="gramStart"/>
+        <w:t>до</w:t>
+      </w:r>
       <w:r>
         <w:rPr>
           <w:rFonts w:ascii="Times New Roman" w:hAnsi="Times New Roman"/>
           <w:sz w:val="22"/>
           <w:szCs w:val="22"/>
-        </w:rPr>
-        <w:t>year</w:t>
+          <w:lang w:val="ru-RU"/>
+        </w:rPr>
+        <w:t xml:space="preserve"> </w:t>
       </w:r>
       <w:r>
         <w:rPr>
@@ -6029,7 +6067,7 @@
           <w:szCs w:val="22"/>
           <w:lang w:val="ru-RU"/>
         </w:rPr>
-        <w:t xml:space="preserve"> }}</w:t>
+        <w:t>минования</w:t>
       </w:r>
       <w:r>
         <w:rPr>
@@ -6038,7 +6076,7 @@
           <w:szCs w:val="22"/>
           <w:lang w:val="ru-RU"/>
         </w:rPr>
-        <w:t>г</w:t>
+        <w:t xml:space="preserve"> </w:t>
       </w:r>
       <w:r>
         <w:rPr>
@@ -6047,9 +6085,8 @@
           <w:szCs w:val="22"/>
           <w:lang w:val="ru-RU"/>
         </w:rPr>
-        <w:t>.</w:t>
-      </w:r>
-      <w:proofErr w:type="gramEnd"/>
+        <w:t>надобности</w:t>
+      </w:r>
       <w:r>
         <w:rPr>
           <w:rFonts w:ascii="Times New Roman" w:hAnsi="Times New Roman"/>
@@ -6057,7 +6094,7 @@
           <w:szCs w:val="22"/>
           <w:lang w:val="ru-RU"/>
         </w:rPr>
-        <w:t xml:space="preserve"> </w:t>
+        <w:t xml:space="preserve">. </w:t>
       </w:r>
       <w:r>
         <w:rPr>
@@ -6066,81 +6103,7 @@
           <w:szCs w:val="22"/>
           <w:lang w:val="ru-RU"/>
         </w:rPr>
-        <w:t>до</w:t>
-      </w:r>
-      <w:r>
-        <w:rPr>
-          <w:rFonts w:ascii="Times New Roman" w:hAnsi="Times New Roman"/>
-          <w:sz w:val="22"/>
-          <w:szCs w:val="22"/>
-          <w:lang w:val="ru-RU"/>
-        </w:rPr>
-        <w:t xml:space="preserve"> </w:t>
-      </w:r>
-      <w:r>
-        <w:rPr>
-          <w:rFonts w:ascii="Times New Roman" w:hAnsi="Times New Roman"/>
-          <w:sz w:val="22"/>
-          <w:szCs w:val="22"/>
-          <w:lang w:val="ru-RU"/>
-        </w:rPr>
-        <w:t>минования</w:t>
-      </w:r>
-      <w:r>
-        <w:rPr>
-          <w:rFonts w:ascii="Times New Roman" w:hAnsi="Times New Roman"/>
-          <w:sz w:val="22"/>
-          <w:szCs w:val="22"/>
-          <w:lang w:val="ru-RU"/>
-        </w:rPr>
-        <w:t xml:space="preserve"> </w:t>
-      </w:r>
-      <w:r>
-        <w:rPr>
-          <w:rFonts w:ascii="Times New Roman" w:hAnsi="Times New Roman"/>
-          <w:sz w:val="22"/>
-          <w:szCs w:val="22"/>
-          <w:lang w:val="ru-RU"/>
-        </w:rPr>
-        <w:t>надобности</w:t>
-      </w:r>
-      <w:r>
-        <w:rPr>
-          <w:rFonts w:ascii="Times New Roman" w:hAnsi="Times New Roman"/>
-          <w:sz w:val="22"/>
-          <w:szCs w:val="22"/>
-          <w:lang w:val="ru-RU"/>
-        </w:rPr>
-        <w:t xml:space="preserve">. </w:t>
-      </w:r>
-      <w:r>
-        <w:rPr>
-          <w:rFonts w:ascii="Times New Roman" w:hAnsi="Times New Roman"/>
-          <w:sz w:val="22"/>
-          <w:szCs w:val="22"/>
-          <w:lang w:val="ru-RU"/>
-        </w:rPr>
-        <w:t xml:space="preserve">Я оставляю за собой право отозвать своё согласие на обработку персональных данных посредством составления соответствующего письменного документа, который может быть направлен мной в адрес Оператора по почте заказным письмом с уведомлением о вручении либо вручён лично под расписку представителю Оператора. В случае получения моего письменного заявления об отзыве настоящего согласия на обработку персональных данных Оператор обязан прекратить их обработку в течение периода времени, необходимого для завершения взаиморасчетов </w:t>
-      </w:r>
-      <w:proofErr w:type="gramStart"/>
-      <w:r>
-        <w:rPr>
-          <w:rFonts w:ascii="Times New Roman" w:hAnsi="Times New Roman"/>
-          <w:sz w:val="22"/>
-          <w:szCs w:val="22"/>
-          <w:lang w:val="ru-RU"/>
-        </w:rPr>
-        <w:t>по оплате</w:t>
-      </w:r>
-      <w:proofErr w:type="gramEnd"/>
-      <w:r>
-        <w:rPr>
-          <w:rFonts w:ascii="Times New Roman" w:hAnsi="Times New Roman"/>
-          <w:sz w:val="22"/>
-          <w:szCs w:val="22"/>
-          <w:lang w:val="ru-RU"/>
-        </w:rPr>
-        <w:t xml:space="preserve"> оказанной мне (несовершеннолетнему пациенту/лицу, признанному недееспособным) до этого медицинской помощи.</w:t>
+        <w:t>Я оставляю за собой право отозвать своё согласие на обработку персональных данных посредством составления соответствующего письменного документа, который может быть направлен мной в адрес Оператора по почте заказным письмом с уведомлением о вручении либо вручён лично под расписку представителю Оператора. В случае получения моего письменного заявления об отзыве настоящего согласия на обработку персональных данных Оператор обязан прекратить их обработку в течение периода времени, необходимого для завершения взаиморасчетов по оплате оказанной мне (несовершеннолетнему пациенту/лицу, признанному недееспособным) до этого медицинской помощи.</w:t>
       </w:r>
     </w:p>
     <w:p>
@@ -6192,21 +6155,28 @@
               <w:spacing w:after="0" w:line="240" w:lineRule="auto"/>
               <w:jc w:val="both"/>
             </w:pPr>
-            <w:proofErr w:type="gramStart"/>
             <w:r>
               <w:rPr>
                 <w:rFonts w:ascii="Times New Roman" w:hAnsi="Times New Roman"/>
                 <w:lang w:val="ru-RU"/>
               </w:rPr>
-              <w:t>{{ appointment</w:t>
-            </w:r>
-            <w:proofErr w:type="gramEnd"/>
+              <w:t xml:space="preserve">{{ </w:t>
+            </w:r>
+            <w:proofErr w:type="spellStart"/>
             <w:r>
               <w:rPr>
                 <w:rFonts w:ascii="Times New Roman" w:hAnsi="Times New Roman"/>
                 <w:lang w:val="ru-RU"/>
               </w:rPr>
-              <w:t>_date}} года.</w:t>
+              <w:t>appointment_date</w:t>
+            </w:r>
+            <w:proofErr w:type="spellEnd"/>
+            <w:r>
+              <w:rPr>
+                <w:rFonts w:ascii="Times New Roman" w:hAnsi="Times New Roman"/>
+                <w:lang w:val="ru-RU"/>
+              </w:rPr>
+              <w:t>}} года.</w:t>
             </w:r>
           </w:p>
         </w:tc>
@@ -6408,32 +6378,151 @@
           <w:color w:val="000000"/>
           <w:lang w:val="ru-RU"/>
         </w:rPr>
-        <w:t xml:space="preserve">{{ surname }} {{ first_name }} {{ last_name }}, </w:t>
-      </w:r>
+        <w:t xml:space="preserve">{{ </w:t>
+      </w:r>
+      <w:proofErr w:type="spellStart"/>
       <w:r>
         <w:rPr>
           <w:rStyle w:val="11"/>
           <w:rFonts w:ascii="Times New Roman" w:hAnsi="Times New Roman"/>
+          <w:b/>
+          <w:bCs/>
           <w:color w:val="000000"/>
           <w:lang w:val="ru-RU"/>
         </w:rPr>
-        <w:t>д</w:t>
-      </w:r>
+        <w:t>surname</w:t>
+      </w:r>
+      <w:proofErr w:type="spellEnd"/>
       <w:r>
         <w:rPr>
           <w:rStyle w:val="11"/>
           <w:rFonts w:ascii="Times New Roman" w:hAnsi="Times New Roman"/>
+          <w:b/>
+          <w:bCs/>
           <w:color w:val="000000"/>
           <w:lang w:val="ru-RU"/>
         </w:rPr>
-        <w:t xml:space="preserve">обровольно даю свое согласие на проведение опроса, в том числе выявления жалоб, сбор анамнеза; осмотр, в том числе пальпацию, перкуссию, аускультацию, риноскопию, фарингоскопию, ректальные исследования (на приёме гастроэнтеролога — при клинической потребности), антропометрические исследования, термометрию, тонометрию, исследования нервной системы (чувствительной и двигательной сферы), неинвазивные исследования органа слуха и слуховых функций, лабораторные методы исследования, в том числе клинические, биохимические, бактериологические, вирусологические, серологические, иммунологические, функциональные методы исследования, в том числе ЭКГ,  пикфлуометрию, ультразвуковые исследования и доплерографические исследования; введение лекарственных препаратов по назначению врача, в том числе внутримышечно, внутривенно, подкожно, внутрикожно; медицинский массаж, для получения мною первичной медико-санитарной помощи / получения первичной медико-санитарной помощи лицом, законным  представителем которого я  являюсь,  в </w:t>
-      </w:r>
-      <w:r>
-        <w:rPr>
-          <w:rFonts w:ascii="Times New Roman" w:hAnsi="Times New Roman"/>
-          <w:lang w:val="ru-RU"/>
-        </w:rPr>
-        <w:t>обработку ООО МЦ «РевмаМед».</w:t>
+        <w:t xml:space="preserve"> }} {{ </w:t>
+      </w:r>
+      <w:proofErr w:type="spellStart"/>
+      <w:r>
+        <w:rPr>
+          <w:rStyle w:val="11"/>
+          <w:rFonts w:ascii="Times New Roman" w:hAnsi="Times New Roman"/>
+          <w:b/>
+          <w:bCs/>
+          <w:color w:val="000000"/>
+          <w:lang w:val="ru-RU"/>
+        </w:rPr>
+        <w:t>first_name</w:t>
+      </w:r>
+      <w:proofErr w:type="spellEnd"/>
+      <w:r>
+        <w:rPr>
+          <w:rStyle w:val="11"/>
+          <w:rFonts w:ascii="Times New Roman" w:hAnsi="Times New Roman"/>
+          <w:b/>
+          <w:bCs/>
+          <w:color w:val="000000"/>
+          <w:lang w:val="ru-RU"/>
+        </w:rPr>
+        <w:t xml:space="preserve"> }} {{ </w:t>
+      </w:r>
+      <w:proofErr w:type="spellStart"/>
+      <w:r>
+        <w:rPr>
+          <w:rStyle w:val="11"/>
+          <w:rFonts w:ascii="Times New Roman" w:hAnsi="Times New Roman"/>
+          <w:b/>
+          <w:bCs/>
+          <w:color w:val="000000"/>
+          <w:lang w:val="ru-RU"/>
+        </w:rPr>
+        <w:t>last_name</w:t>
+      </w:r>
+      <w:proofErr w:type="spellEnd"/>
+      <w:r>
+        <w:rPr>
+          <w:rStyle w:val="11"/>
+          <w:rFonts w:ascii="Times New Roman" w:hAnsi="Times New Roman"/>
+          <w:b/>
+          <w:bCs/>
+          <w:color w:val="000000"/>
+          <w:lang w:val="ru-RU"/>
+        </w:rPr>
+        <w:t xml:space="preserve"> }}, </w:t>
+      </w:r>
+      <w:r>
+        <w:rPr>
+          <w:rStyle w:val="11"/>
+          <w:rFonts w:ascii="Times New Roman" w:hAnsi="Times New Roman"/>
+          <w:color w:val="000000"/>
+          <w:lang w:val="ru-RU"/>
+        </w:rPr>
+        <w:t xml:space="preserve">добровольно даю свое согласие на проведение опроса, в том числе выявления жалоб, сбор анамнеза; осмотр, в том числе пальпацию, перкуссию, аускультацию, риноскопию, фарингоскопию, ректальные исследования (на приёме гастроэнтеролога — при клинической потребности), антропометрические исследования, термометрию, тонометрию, исследования нервной системы (чувствительной и двигательной сферы), неинвазивные исследования органа слуха и слуховых функций, лабораторные методы исследования, в том числе клинические, биохимические, бактериологические, вирусологические, серологические, иммунологические, функциональные методы исследования, в том числе ЭКГ,  </w:t>
+      </w:r>
+      <w:proofErr w:type="spellStart"/>
+      <w:r>
+        <w:rPr>
+          <w:rStyle w:val="11"/>
+          <w:rFonts w:ascii="Times New Roman" w:hAnsi="Times New Roman"/>
+          <w:color w:val="000000"/>
+          <w:lang w:val="ru-RU"/>
+        </w:rPr>
+        <w:t>пикфлуометрию</w:t>
+      </w:r>
+      <w:proofErr w:type="spellEnd"/>
+      <w:r>
+        <w:rPr>
+          <w:rStyle w:val="11"/>
+          <w:rFonts w:ascii="Times New Roman" w:hAnsi="Times New Roman"/>
+          <w:color w:val="000000"/>
+          <w:lang w:val="ru-RU"/>
+        </w:rPr>
+        <w:t xml:space="preserve">, ультразвуковые исследования и </w:t>
+      </w:r>
+      <w:proofErr w:type="spellStart"/>
+      <w:r>
+        <w:rPr>
+          <w:rStyle w:val="11"/>
+          <w:rFonts w:ascii="Times New Roman" w:hAnsi="Times New Roman"/>
+          <w:color w:val="000000"/>
+          <w:lang w:val="ru-RU"/>
+        </w:rPr>
+        <w:t>доплерографические</w:t>
+      </w:r>
+      <w:proofErr w:type="spellEnd"/>
+      <w:r>
+        <w:rPr>
+          <w:rStyle w:val="11"/>
+          <w:rFonts w:ascii="Times New Roman" w:hAnsi="Times New Roman"/>
+          <w:color w:val="000000"/>
+          <w:lang w:val="ru-RU"/>
+        </w:rPr>
+        <w:t xml:space="preserve"> исследования; введение лекарственных препаратов по назначению врача, в том числе внутримышечно, внутривенно, подкожно, внутрикожно; медицинский массаж, для получения мною первичной медико-санитарной помощи / получения первичной медико-санитарной помощи лицом, законным  представителем которого я  являюсь,  в </w:t>
+      </w:r>
+      <w:r>
+        <w:rPr>
+          <w:rFonts w:ascii="Times New Roman" w:hAnsi="Times New Roman"/>
+          <w:lang w:val="ru-RU"/>
+        </w:rPr>
+        <w:t>обработку ООО МЦ «</w:t>
+      </w:r>
+      <w:proofErr w:type="spellStart"/>
+      <w:r>
+        <w:rPr>
+          <w:rFonts w:ascii="Times New Roman" w:hAnsi="Times New Roman"/>
+          <w:lang w:val="ru-RU"/>
+        </w:rPr>
+        <w:t>РевмаМед</w:t>
+      </w:r>
+      <w:proofErr w:type="spellEnd"/>
+      <w:r>
+        <w:rPr>
+          <w:rFonts w:ascii="Times New Roman" w:hAnsi="Times New Roman"/>
+          <w:lang w:val="ru-RU"/>
+        </w:rPr>
+        <w:t>».</w:t>
       </w:r>
     </w:p>
     <w:p>
@@ -6510,7 +6599,6 @@
         </w:rPr>
         <w:t xml:space="preserve"> </w:t>
       </w:r>
-      <w:proofErr w:type="gramStart"/>
       <w:r>
         <w:rPr>
           <w:rFonts w:ascii="Times New Roman" w:hAnsi="Times New Roman"/>
@@ -6521,7 +6609,7 @@
         </w:rPr>
         <w:t xml:space="preserve">{{  </w:t>
       </w:r>
-      <w:proofErr w:type="gramEnd"/>
+      <w:proofErr w:type="spellStart"/>
       <w:r>
         <w:rPr>
           <w:rFonts w:ascii="Times New Roman" w:hAnsi="Times New Roman"/>
@@ -6530,9 +6618,9 @@
           <w:color w:val="000000"/>
           <w:shd w:val="clear" w:color="auto" w:fill="FFFFFF"/>
         </w:rPr>
-        <w:t>doctor_</w:t>
-      </w:r>
-      <w:proofErr w:type="gramStart"/>
+        <w:t>doctor_name</w:t>
+      </w:r>
+      <w:proofErr w:type="spellEnd"/>
       <w:r>
         <w:rPr>
           <w:rFonts w:ascii="Times New Roman" w:hAnsi="Times New Roman"/>
@@ -6541,9 +6629,8 @@
           <w:color w:val="000000"/>
           <w:shd w:val="clear" w:color="auto" w:fill="FFFFFF"/>
         </w:rPr>
-        <w:t>name }</w:t>
-      </w:r>
-      <w:proofErr w:type="gramEnd"/>
+        <w:t xml:space="preserve"> }} </w:t>
+      </w:r>
       <w:r>
         <w:rPr>
           <w:rFonts w:ascii="Times New Roman" w:hAnsi="Times New Roman"/>
@@ -6551,8 +6638,9 @@
           <w:bCs/>
           <w:color w:val="000000"/>
           <w:shd w:val="clear" w:color="auto" w:fill="FFFFFF"/>
-        </w:rPr>
-        <w:t xml:space="preserve">} </w:t>
+          <w:lang w:val="ru-RU"/>
+        </w:rPr>
+        <w:t>врач</w:t>
       </w:r>
       <w:r>
         <w:rPr>
@@ -6561,31 +6649,10 @@
           <w:bCs/>
           <w:color w:val="000000"/>
           <w:shd w:val="clear" w:color="auto" w:fill="FFFFFF"/>
-          <w:lang w:val="ru-RU"/>
-        </w:rPr>
-        <w:t>врач</w:t>
-      </w:r>
-      <w:r>
-        <w:rPr>
-          <w:rFonts w:ascii="Times New Roman" w:hAnsi="Times New Roman"/>
-          <w:b/>
-          <w:bCs/>
-          <w:color w:val="000000"/>
-          <w:shd w:val="clear" w:color="auto" w:fill="FFFFFF"/>
-        </w:rPr>
-        <w:t xml:space="preserve"> </w:t>
-      </w:r>
-      <w:proofErr w:type="gramStart"/>
-      <w:r>
-        <w:rPr>
-          <w:rFonts w:ascii="Times New Roman" w:hAnsi="Times New Roman"/>
-          <w:b/>
-          <w:bCs/>
-          <w:color w:val="000000"/>
-          <w:shd w:val="clear" w:color="auto" w:fill="FFFFFF"/>
-        </w:rPr>
-        <w:t xml:space="preserve">{{ </w:t>
-      </w:r>
+        </w:rPr>
+        <w:t xml:space="preserve"> {{ </w:t>
+      </w:r>
+      <w:proofErr w:type="spellStart"/>
       <w:r>
         <w:rPr>
           <w:rFonts w:ascii="Times New Roman" w:hAnsi="Times New Roman"/>
@@ -6593,9 +6660,9 @@
           <w:bCs/>
           <w:shd w:val="clear" w:color="auto" w:fill="FFFFFF"/>
         </w:rPr>
-        <w:t>doctor</w:t>
-      </w:r>
-      <w:proofErr w:type="gramEnd"/>
+        <w:t>doctor_specialization</w:t>
+      </w:r>
+      <w:proofErr w:type="spellEnd"/>
       <w:r>
         <w:rPr>
           <w:rFonts w:ascii="Times New Roman" w:hAnsi="Times New Roman"/>
@@ -6603,27 +6670,7 @@
           <w:bCs/>
           <w:shd w:val="clear" w:color="auto" w:fill="FFFFFF"/>
         </w:rPr>
-        <w:t>_</w:t>
-      </w:r>
-      <w:proofErr w:type="gramStart"/>
-      <w:r>
-        <w:rPr>
-          <w:rFonts w:ascii="Times New Roman" w:hAnsi="Times New Roman"/>
-          <w:b/>
-          <w:bCs/>
-          <w:shd w:val="clear" w:color="auto" w:fill="FFFFFF"/>
-        </w:rPr>
-        <w:t>specialization }</w:t>
-      </w:r>
-      <w:proofErr w:type="gramEnd"/>
-      <w:r>
-        <w:rPr>
-          <w:rFonts w:ascii="Times New Roman" w:hAnsi="Times New Roman"/>
-          <w:b/>
-          <w:bCs/>
-          <w:shd w:val="clear" w:color="auto" w:fill="FFFFFF"/>
-        </w:rPr>
-        <w:t>}</w:t>
+        <w:t xml:space="preserve"> }}</w:t>
       </w:r>
       <w:r>
         <w:rPr>
@@ -6662,27 +6709,7 @@
           <w:shd w:val="clear" w:color="auto" w:fill="FFFFFF"/>
           <w:lang w:val="ru-RU"/>
         </w:rPr>
-        <w:t xml:space="preserve">в доступной для меня форме мне разъяснены цели, методы оказания медицинской </w:t>
-      </w:r>
-      <w:proofErr w:type="gramStart"/>
-      <w:r>
-        <w:rPr>
-          <w:rFonts w:ascii="Times New Roman" w:hAnsi="Times New Roman"/>
-          <w:color w:val="000000"/>
-          <w:shd w:val="clear" w:color="auto" w:fill="FFFFFF"/>
-          <w:lang w:val="ru-RU"/>
-        </w:rPr>
-        <w:t xml:space="preserve">помощи,   </w:t>
-      </w:r>
-      <w:proofErr w:type="gramEnd"/>
-      <w:r>
-        <w:rPr>
-          <w:rFonts w:ascii="Times New Roman" w:hAnsi="Times New Roman"/>
-          <w:color w:val="000000"/>
-          <w:shd w:val="clear" w:color="auto" w:fill="FFFFFF"/>
-          <w:lang w:val="ru-RU"/>
-        </w:rPr>
-        <w:t xml:space="preserve">    связанный с ними риск, возможные варианты медицинских вмешательств, их последствия, в том числе вероятность развития осложнений, а также предполагаемые результаты оказания медицинской помощи. Мне разъяснено, что я имею право отказаться от одного или нескольких видов медицинских вмешательств, включенных в Перечень определенных видов медицинских вмешательств, на которые граждане дают информированное добровольное согласие при выборе врача и медицинской организации для получения первичной медико-санитарной помощи, утвержденный приказом Министерства здравоохранения и социального развития Российской Федерации от 23 апреля 2012 г. </w:t>
+        <w:t xml:space="preserve">в доступной для меня форме мне разъяснены цели, методы оказания медицинской помощи,       связанный с ними риск, возможные варианты медицинских вмешательств, их последствия, в том числе вероятность развития осложнений, а также предполагаемые результаты оказания медицинской помощи. Мне разъяснено, что я имею право отказаться от одного или нескольких видов медицинских вмешательств, включенных в Перечень определенных видов медицинских вмешательств, на которые граждане дают информированное добровольное согласие при выборе врача и медицинской организации для получения первичной медико-санитарной помощи, утвержденный приказом Министерства здравоохранения и социального развития Российской Федерации от 23 апреля 2012 г. </w:t>
       </w:r>
       <w:r>
         <w:rPr>
@@ -6933,23 +6960,23 @@
           <w:rFonts w:ascii="Times New Roman" w:hAnsi="Times New Roman"/>
           <w:lang w:val="ru-RU"/>
         </w:rPr>
-        <w:t xml:space="preserve">Настоящее информированное добровольное согласие действует в течение всего срока оказания мне (представляемому) медицинской помощи </w:t>
-      </w:r>
-      <w:proofErr w:type="gramStart"/>
-      <w:r>
-        <w:rPr>
-          <w:rFonts w:ascii="Times New Roman" w:hAnsi="Times New Roman"/>
-          <w:lang w:val="ru-RU"/>
-        </w:rPr>
-        <w:t>в  ООО</w:t>
-      </w:r>
-      <w:proofErr w:type="gramEnd"/>
-      <w:r>
-        <w:rPr>
-          <w:rFonts w:ascii="Times New Roman" w:hAnsi="Times New Roman"/>
-          <w:lang w:val="ru-RU"/>
-        </w:rPr>
-        <w:t xml:space="preserve"> МЦ «РевмаМед» или до момента отзыва мною настоящего согласия. </w:t>
+        <w:t>Настоящее информированное добровольное согласие действует в течение всего срока оказания мне (представляемому) медицинской помощи в  ООО МЦ «</w:t>
+      </w:r>
+      <w:proofErr w:type="spellStart"/>
+      <w:r>
+        <w:rPr>
+          <w:rFonts w:ascii="Times New Roman" w:hAnsi="Times New Roman"/>
+          <w:lang w:val="ru-RU"/>
+        </w:rPr>
+        <w:t>РевмаМед</w:t>
+      </w:r>
+      <w:proofErr w:type="spellEnd"/>
+      <w:r>
+        <w:rPr>
+          <w:rFonts w:ascii="Times New Roman" w:hAnsi="Times New Roman"/>
+          <w:lang w:val="ru-RU"/>
+        </w:rPr>
+        <w:t xml:space="preserve">» или до момента отзыва мною настоящего согласия. </w:t>
       </w:r>
     </w:p>
     <w:p>
@@ -6998,21 +7025,28 @@
               <w:spacing w:after="0" w:line="312" w:lineRule="auto"/>
               <w:jc w:val="both"/>
             </w:pPr>
-            <w:proofErr w:type="gramStart"/>
             <w:r>
               <w:rPr>
                 <w:rFonts w:ascii="Times New Roman" w:hAnsi="Times New Roman"/>
                 <w:lang w:val="ru-RU"/>
               </w:rPr>
-              <w:t>{{ appointment</w:t>
-            </w:r>
-            <w:proofErr w:type="gramEnd"/>
+              <w:t xml:space="preserve">{{ </w:t>
+            </w:r>
+            <w:proofErr w:type="spellStart"/>
             <w:r>
               <w:rPr>
                 <w:rFonts w:ascii="Times New Roman" w:hAnsi="Times New Roman"/>
                 <w:lang w:val="ru-RU"/>
               </w:rPr>
-              <w:t>_date}} года.</w:t>
+              <w:t>appointment_date</w:t>
+            </w:r>
+            <w:proofErr w:type="spellEnd"/>
+            <w:r>
+              <w:rPr>
+                <w:rFonts w:ascii="Times New Roman" w:hAnsi="Times New Roman"/>
+                <w:lang w:val="ru-RU"/>
+              </w:rPr>
+              <w:t>}} года.</w:t>
             </w:r>
           </w:p>
         </w:tc>
@@ -7172,7 +7206,6 @@
               </w:rPr>
               <w:t xml:space="preserve"> </w:t>
             </w:r>
-            <w:proofErr w:type="gramStart"/>
             <w:r>
               <w:rPr>
                 <w:rFonts w:ascii="Times New Roman" w:hAnsi="Times New Roman"/>
@@ -7181,36 +7214,21 @@
               </w:rPr>
               <w:t xml:space="preserve">{{ </w:t>
             </w:r>
+            <w:proofErr w:type="spellStart"/>
             <w:r>
               <w:rPr>
                 <w:rFonts w:ascii="Times New Roman" w:hAnsi="Times New Roman"/>
                 <w:shd w:val="clear" w:color="auto" w:fill="FFFFFF"/>
               </w:rPr>
-              <w:t>doctor</w:t>
-            </w:r>
-            <w:proofErr w:type="gramEnd"/>
+              <w:t>doctor_specialization</w:t>
+            </w:r>
+            <w:proofErr w:type="spellEnd"/>
             <w:r>
               <w:rPr>
                 <w:rFonts w:ascii="Times New Roman" w:hAnsi="Times New Roman"/>
                 <w:shd w:val="clear" w:color="auto" w:fill="FFFFFF"/>
               </w:rPr>
-              <w:t>_</w:t>
-            </w:r>
-            <w:proofErr w:type="gramStart"/>
-            <w:r>
-              <w:rPr>
-                <w:rFonts w:ascii="Times New Roman" w:hAnsi="Times New Roman"/>
-                <w:shd w:val="clear" w:color="auto" w:fill="FFFFFF"/>
-              </w:rPr>
-              <w:t>specialization }</w:t>
-            </w:r>
-            <w:proofErr w:type="gramEnd"/>
-            <w:r>
-              <w:rPr>
-                <w:rFonts w:ascii="Times New Roman" w:hAnsi="Times New Roman"/>
-                <w:shd w:val="clear" w:color="auto" w:fill="FFFFFF"/>
-              </w:rPr>
-              <w:t>}</w:t>
+              <w:t xml:space="preserve"> }}</w:t>
             </w:r>
             <w:r>
               <w:rPr>
@@ -7218,26 +7236,18 @@
                 <w:color w:val="000000"/>
                 <w:shd w:val="clear" w:color="auto" w:fill="FFFFFF"/>
               </w:rPr>
-              <w:t xml:space="preserve"> </w:t>
-            </w:r>
-            <w:proofErr w:type="gramStart"/>
+              <w:t xml:space="preserve"> {{  </w:t>
+            </w:r>
+            <w:proofErr w:type="spellStart"/>
             <w:r>
               <w:rPr>
                 <w:rFonts w:ascii="Times New Roman" w:hAnsi="Times New Roman"/>
                 <w:color w:val="000000"/>
                 <w:shd w:val="clear" w:color="auto" w:fill="FFFFFF"/>
               </w:rPr>
-              <w:t xml:space="preserve">{{  </w:t>
-            </w:r>
-            <w:proofErr w:type="gramEnd"/>
-            <w:r>
-              <w:rPr>
-                <w:rFonts w:ascii="Times New Roman" w:hAnsi="Times New Roman"/>
-                <w:color w:val="000000"/>
-                <w:shd w:val="clear" w:color="auto" w:fill="FFFFFF"/>
-              </w:rPr>
               <w:t>doctor_name</w:t>
             </w:r>
+            <w:proofErr w:type="spellEnd"/>
             <w:r>
               <w:rPr>
                 <w:rFonts w:ascii="Times New Roman" w:hAnsi="Times New Roman"/>

</xml_diff>